<commit_message>
commit viernes 9 de octubre
</commit_message>
<xml_diff>
--- a/CIBER/Prácticas/UT1/Practica1/Practica_UT1_Identificar_para_proteger_v2.docx
+++ b/CIBER/Prácticas/UT1/Practica1/Practica_UT1_Identificar_para_proteger_v2.docx
@@ -45,14 +45,14 @@
         <w:tblLook w:val="04a0" w:firstRow="1" w:noVBand="1" w:lastRow="0" w:firstColumn="1" w:lastColumn="0" w:noHBand="0"/>
       </w:tblPr>
       <w:tblGrid>
-        <w:gridCol w:w="2448"/>
-        <w:gridCol w:w="6555"/>
+        <w:gridCol w:w="2447"/>
+        <w:gridCol w:w="6556"/>
       </w:tblGrid>
       <w:tr>
         <w:trPr/>
         <w:tc>
           <w:tcPr>
-            <w:tcW w:w="2448" w:type="dxa"/>
+            <w:tcW w:w="2447" w:type="dxa"/>
             <w:tcBorders>
               <w:top w:val="single" w:sz="4" w:space="0" w:color="9DB3CC"/>
               <w:start w:val="single" w:sz="4" w:space="0" w:color="9DB3CC"/>
@@ -82,7 +82,7 @@
         </w:tc>
         <w:tc>
           <w:tcPr>
-            <w:tcW w:w="6555" w:type="dxa"/>
+            <w:tcW w:w="6556" w:type="dxa"/>
             <w:tcBorders>
               <w:top w:val="single" w:sz="4" w:space="0" w:color="9DB3CC"/>
               <w:start w:val="single" w:sz="4" w:space="0" w:color="9DB3CC"/>
@@ -112,7 +112,7 @@
         <w:trPr/>
         <w:tc>
           <w:tcPr>
-            <w:tcW w:w="2448" w:type="dxa"/>
+            <w:tcW w:w="2447" w:type="dxa"/>
             <w:tcBorders>
               <w:top w:val="single" w:sz="4" w:space="0" w:color="9DB3CC"/>
               <w:start w:val="single" w:sz="4" w:space="0" w:color="9DB3CC"/>
@@ -142,7 +142,7 @@
         </w:tc>
         <w:tc>
           <w:tcPr>
-            <w:tcW w:w="6555" w:type="dxa"/>
+            <w:tcW w:w="6556" w:type="dxa"/>
             <w:tcBorders>
               <w:top w:val="single" w:sz="4" w:space="0" w:color="9DB3CC"/>
               <w:start w:val="single" w:sz="4" w:space="0" w:color="9DB3CC"/>
@@ -172,7 +172,7 @@
         <w:trPr/>
         <w:tc>
           <w:tcPr>
-            <w:tcW w:w="2448" w:type="dxa"/>
+            <w:tcW w:w="2447" w:type="dxa"/>
             <w:tcBorders>
               <w:top w:val="single" w:sz="4" w:space="0" w:color="9DB3CC"/>
               <w:start w:val="single" w:sz="4" w:space="0" w:color="9DB3CC"/>
@@ -202,7 +202,7 @@
         </w:tc>
         <w:tc>
           <w:tcPr>
-            <w:tcW w:w="6555" w:type="dxa"/>
+            <w:tcW w:w="6556" w:type="dxa"/>
             <w:tcBorders>
               <w:top w:val="single" w:sz="4" w:space="0" w:color="9DB3CC"/>
               <w:start w:val="single" w:sz="4" w:space="0" w:color="9DB3CC"/>
@@ -232,7 +232,7 @@
         <w:trPr/>
         <w:tc>
           <w:tcPr>
-            <w:tcW w:w="2448" w:type="dxa"/>
+            <w:tcW w:w="2447" w:type="dxa"/>
             <w:tcBorders>
               <w:top w:val="single" w:sz="4" w:space="0" w:color="9DB3CC"/>
               <w:start w:val="single" w:sz="4" w:space="0" w:color="9DB3CC"/>
@@ -262,7 +262,7 @@
         </w:tc>
         <w:tc>
           <w:tcPr>
-            <w:tcW w:w="6555" w:type="dxa"/>
+            <w:tcW w:w="6556" w:type="dxa"/>
             <w:tcBorders>
               <w:top w:val="single" w:sz="4" w:space="0" w:color="9DB3CC"/>
               <w:start w:val="single" w:sz="4" w:space="0" w:color="9DB3CC"/>
@@ -292,7 +292,7 @@
         <w:trPr/>
         <w:tc>
           <w:tcPr>
-            <w:tcW w:w="2448" w:type="dxa"/>
+            <w:tcW w:w="2447" w:type="dxa"/>
             <w:tcBorders>
               <w:top w:val="single" w:sz="4" w:space="0" w:color="9DB3CC"/>
               <w:start w:val="single" w:sz="4" w:space="0" w:color="9DB3CC"/>
@@ -322,7 +322,7 @@
         </w:tc>
         <w:tc>
           <w:tcPr>
-            <w:tcW w:w="6555" w:type="dxa"/>
+            <w:tcW w:w="6556" w:type="dxa"/>
             <w:tcBorders>
               <w:top w:val="single" w:sz="4" w:space="0" w:color="9DB3CC"/>
               <w:start w:val="single" w:sz="4" w:space="0" w:color="9DB3CC"/>
@@ -352,7 +352,7 @@
         <w:trPr/>
         <w:tc>
           <w:tcPr>
-            <w:tcW w:w="2448" w:type="dxa"/>
+            <w:tcW w:w="2447" w:type="dxa"/>
             <w:tcBorders>
               <w:top w:val="single" w:sz="4" w:space="0" w:color="9DB3CC"/>
               <w:start w:val="single" w:sz="4" w:space="0" w:color="9DB3CC"/>
@@ -382,7 +382,7 @@
         </w:tc>
         <w:tc>
           <w:tcPr>
-            <w:tcW w:w="6555" w:type="dxa"/>
+            <w:tcW w:w="6556" w:type="dxa"/>
             <w:tcBorders>
               <w:top w:val="single" w:sz="4" w:space="0" w:color="9DB3CC"/>
               <w:start w:val="single" w:sz="4" w:space="0" w:color="9DB3CC"/>
@@ -881,18 +881,16 @@
         <w:tblLook w:val="04a0" w:firstRow="1" w:noVBand="1" w:lastRow="0" w:firstColumn="1" w:lastColumn="0" w:noHBand="0"/>
       </w:tblPr>
       <w:tblGrid>
-        <w:gridCol w:w="1528"/>
-        <w:gridCol w:w="1946"/>
-        <w:gridCol w:w="3220"/>
-        <w:gridCol w:w="2309"/>
+        <w:gridCol w:w="1527"/>
+        <w:gridCol w:w="1947"/>
+        <w:gridCol w:w="3219"/>
+        <w:gridCol w:w="2310"/>
       </w:tblGrid>
       <w:tr>
-        <w:trPr>
-          <w:tblHeader w:val="true"/>
-        </w:trPr>
-        <w:tc>
-          <w:tcPr>
-            <w:tcW w:w="1528" w:type="dxa"/>
+        <w:trPr/>
+        <w:tc>
+          <w:tcPr>
+            <w:tcW w:w="1527" w:type="dxa"/>
             <w:tcBorders>
               <w:top w:val="single" w:sz="4" w:space="0" w:color="9DB3CC"/>
               <w:start w:val="single" w:sz="4" w:space="0" w:color="9DB3CC"/>
@@ -922,7 +920,7 @@
         </w:tc>
         <w:tc>
           <w:tcPr>
-            <w:tcW w:w="1946" w:type="dxa"/>
+            <w:tcW w:w="1947" w:type="dxa"/>
             <w:tcBorders>
               <w:top w:val="single" w:sz="4" w:space="0" w:color="9DB3CC"/>
               <w:start w:val="single" w:sz="4" w:space="0" w:color="9DB3CC"/>
@@ -952,7 +950,7 @@
         </w:tc>
         <w:tc>
           <w:tcPr>
-            <w:tcW w:w="3220" w:type="dxa"/>
+            <w:tcW w:w="3219" w:type="dxa"/>
             <w:tcBorders>
               <w:top w:val="single" w:sz="4" w:space="0" w:color="9DB3CC"/>
               <w:start w:val="single" w:sz="4" w:space="0" w:color="9DB3CC"/>
@@ -982,7 +980,7 @@
         </w:tc>
         <w:tc>
           <w:tcPr>
-            <w:tcW w:w="2309" w:type="dxa"/>
+            <w:tcW w:w="2310" w:type="dxa"/>
             <w:tcBorders>
               <w:top w:val="single" w:sz="4" w:space="0" w:color="9DB3CC"/>
               <w:start w:val="single" w:sz="4" w:space="0" w:color="9DB3CC"/>
@@ -1015,7 +1013,7 @@
         <w:trPr/>
         <w:tc>
           <w:tcPr>
-            <w:tcW w:w="1528" w:type="dxa"/>
+            <w:tcW w:w="1527" w:type="dxa"/>
             <w:tcBorders>
               <w:top w:val="single" w:sz="4" w:space="0" w:color="9DB3CC"/>
               <w:start w:val="single" w:sz="4" w:space="0" w:color="9DB3CC"/>
@@ -1039,7 +1037,7 @@
         </w:tc>
         <w:tc>
           <w:tcPr>
-            <w:tcW w:w="1946" w:type="dxa"/>
+            <w:tcW w:w="1947" w:type="dxa"/>
             <w:tcBorders>
               <w:top w:val="single" w:sz="4" w:space="0" w:color="9DB3CC"/>
               <w:start w:val="single" w:sz="4" w:space="0" w:color="9DB3CC"/>
@@ -1063,7 +1061,7 @@
         </w:tc>
         <w:tc>
           <w:tcPr>
-            <w:tcW w:w="3220" w:type="dxa"/>
+            <w:tcW w:w="3219" w:type="dxa"/>
             <w:tcBorders>
               <w:top w:val="single" w:sz="4" w:space="0" w:color="9DB3CC"/>
               <w:start w:val="single" w:sz="4" w:space="0" w:color="9DB3CC"/>
@@ -1087,7 +1085,7 @@
         </w:tc>
         <w:tc>
           <w:tcPr>
-            <w:tcW w:w="2309" w:type="dxa"/>
+            <w:tcW w:w="2310" w:type="dxa"/>
             <w:tcBorders>
               <w:top w:val="single" w:sz="4" w:space="0" w:color="9DB3CC"/>
               <w:start w:val="single" w:sz="4" w:space="0" w:color="9DB3CC"/>
@@ -1114,7 +1112,7 @@
         <w:trPr/>
         <w:tc>
           <w:tcPr>
-            <w:tcW w:w="1528" w:type="dxa"/>
+            <w:tcW w:w="1527" w:type="dxa"/>
             <w:tcBorders>
               <w:top w:val="single" w:sz="4" w:space="0" w:color="9DB3CC"/>
               <w:start w:val="single" w:sz="4" w:space="0" w:color="9DB3CC"/>
@@ -1139,7 +1137,7 @@
         </w:tc>
         <w:tc>
           <w:tcPr>
-            <w:tcW w:w="1946" w:type="dxa"/>
+            <w:tcW w:w="1947" w:type="dxa"/>
             <w:tcBorders>
               <w:top w:val="single" w:sz="4" w:space="0" w:color="9DB3CC"/>
               <w:start w:val="single" w:sz="4" w:space="0" w:color="9DB3CC"/>
@@ -1164,7 +1162,7 @@
         </w:tc>
         <w:tc>
           <w:tcPr>
-            <w:tcW w:w="3220" w:type="dxa"/>
+            <w:tcW w:w="3219" w:type="dxa"/>
             <w:tcBorders>
               <w:top w:val="single" w:sz="4" w:space="0" w:color="9DB3CC"/>
               <w:start w:val="single" w:sz="4" w:space="0" w:color="9DB3CC"/>
@@ -1189,7 +1187,7 @@
         </w:tc>
         <w:tc>
           <w:tcPr>
-            <w:tcW w:w="2309" w:type="dxa"/>
+            <w:tcW w:w="2310" w:type="dxa"/>
             <w:tcBorders>
               <w:top w:val="single" w:sz="4" w:space="0" w:color="9DB3CC"/>
               <w:start w:val="single" w:sz="4" w:space="0" w:color="9DB3CC"/>
@@ -1217,7 +1215,7 @@
         <w:trPr/>
         <w:tc>
           <w:tcPr>
-            <w:tcW w:w="1528" w:type="dxa"/>
+            <w:tcW w:w="1527" w:type="dxa"/>
             <w:tcBorders>
               <w:top w:val="single" w:sz="4" w:space="0" w:color="9DB3CC"/>
               <w:start w:val="single" w:sz="4" w:space="0" w:color="9DB3CC"/>
@@ -1241,7 +1239,7 @@
         </w:tc>
         <w:tc>
           <w:tcPr>
-            <w:tcW w:w="1946" w:type="dxa"/>
+            <w:tcW w:w="1947" w:type="dxa"/>
             <w:tcBorders>
               <w:top w:val="single" w:sz="4" w:space="0" w:color="9DB3CC"/>
               <w:start w:val="single" w:sz="4" w:space="0" w:color="9DB3CC"/>
@@ -1265,7 +1263,7 @@
         </w:tc>
         <w:tc>
           <w:tcPr>
-            <w:tcW w:w="3220" w:type="dxa"/>
+            <w:tcW w:w="3219" w:type="dxa"/>
             <w:tcBorders>
               <w:top w:val="single" w:sz="4" w:space="0" w:color="9DB3CC"/>
               <w:start w:val="single" w:sz="4" w:space="0" w:color="9DB3CC"/>
@@ -1289,7 +1287,7 @@
         </w:tc>
         <w:tc>
           <w:tcPr>
-            <w:tcW w:w="2309" w:type="dxa"/>
+            <w:tcW w:w="2310" w:type="dxa"/>
             <w:tcBorders>
               <w:top w:val="single" w:sz="4" w:space="0" w:color="9DB3CC"/>
               <w:start w:val="single" w:sz="4" w:space="0" w:color="9DB3CC"/>
@@ -2379,21 +2377,10 @@
               </w:rPr>
             </w:pPr>
             <w:r>
-              <w:rPr/>
-            </w:r>
-          </w:p>
-          <w:p>
-            <w:pPr>
-              <w:pStyle w:val="Normal"/>
-              <w:spacing w:lineRule="auto" w:line="240" w:before="0" w:after="0"/>
-              <w:rPr/>
-            </w:pPr>
-            <w:r>
               <w:rPr>
                 <w:rFonts w:eastAsia="Consolas" w:ascii="Consolas" w:hAnsi="Consolas"/>
                 <w:sz w:val="18"/>
               </w:rPr>
-              <w:t># 2. Carpeta de nóminas con permisos para todo el mundo</w:t>
             </w:r>
           </w:p>
           <w:p>
@@ -2407,7 +2394,7 @@
                 <w:rFonts w:eastAsia="Consolas" w:ascii="Consolas" w:hAnsi="Consolas"/>
                 <w:sz w:val="18"/>
               </w:rPr>
-              <w:t>sudo mkdir -p /srv/nominas</w:t>
+              <w:t># 2. Carpeta de nóminas con permisos para todo el mundo</w:t>
             </w:r>
           </w:p>
           <w:p>
@@ -2421,7 +2408,7 @@
                 <w:rFonts w:eastAsia="Consolas" w:ascii="Consolas" w:hAnsi="Consolas"/>
                 <w:sz w:val="18"/>
               </w:rPr>
-              <w:t>echo "empleado;importe" | sudo tee /srv/nominas/nominas_enero.csv</w:t>
+              <w:t>sudo mkdir -p /srv/nominas</w:t>
             </w:r>
           </w:p>
           <w:p>
@@ -2435,6 +2422,20 @@
                 <w:rFonts w:eastAsia="Consolas" w:ascii="Consolas" w:hAnsi="Consolas"/>
                 <w:sz w:val="18"/>
               </w:rPr>
+              <w:t>echo "empleado;importe" | sudo tee /srv/nominas/nominas_enero.csv</w:t>
+            </w:r>
+          </w:p>
+          <w:p>
+            <w:pPr>
+              <w:pStyle w:val="Normal"/>
+              <w:spacing w:lineRule="auto" w:line="240" w:before="0" w:after="0"/>
+              <w:rPr/>
+            </w:pPr>
+            <w:r>
+              <w:rPr>
+                <w:rFonts w:eastAsia="Consolas" w:ascii="Consolas" w:hAnsi="Consolas"/>
+                <w:sz w:val="18"/>
+              </w:rPr>
               <w:t>sudo chmod -R 777 /srv/nominas</w:t>
             </w:r>
           </w:p>
@@ -2448,7 +2449,10 @@
               </w:rPr>
             </w:pPr>
             <w:r>
-              <w:rPr/>
+              <w:rPr>
+                <w:rFonts w:eastAsia="Consolas" w:ascii="Consolas" w:hAnsi="Consolas"/>
+                <w:sz w:val="18"/>
+              </w:rPr>
             </w:r>
           </w:p>
           <w:p>
@@ -4126,8 +4130,8 @@
       <w:tblGrid>
         <w:gridCol w:w="2028"/>
         <w:gridCol w:w="2339"/>
-        <w:gridCol w:w="2317"/>
-        <w:gridCol w:w="2319"/>
+        <w:gridCol w:w="2316"/>
+        <w:gridCol w:w="2320"/>
       </w:tblGrid>
       <w:tr>
         <w:trPr>
@@ -4195,7 +4199,7 @@
         </w:tc>
         <w:tc>
           <w:tcPr>
-            <w:tcW w:w="2317" w:type="dxa"/>
+            <w:tcW w:w="2316" w:type="dxa"/>
             <w:tcBorders>
               <w:top w:val="single" w:sz="4" w:space="0" w:color="9DB3CC"/>
               <w:start w:val="single" w:sz="4" w:space="0" w:color="9DB3CC"/>
@@ -4225,7 +4229,7 @@
         </w:tc>
         <w:tc>
           <w:tcPr>
-            <w:tcW w:w="2319" w:type="dxa"/>
+            <w:tcW w:w="2320" w:type="dxa"/>
             <w:tcBorders>
               <w:top w:val="single" w:sz="4" w:space="0" w:color="9DB3CC"/>
               <w:start w:val="single" w:sz="4" w:space="0" w:color="9DB3CC"/>
@@ -4307,7 +4311,7 @@
         </w:tc>
         <w:tc>
           <w:tcPr>
-            <w:tcW w:w="2317" w:type="dxa"/>
+            <w:tcW w:w="2316" w:type="dxa"/>
             <w:tcBorders>
               <w:top w:val="single" w:sz="4" w:space="0" w:color="9DB3CC"/>
               <w:start w:val="single" w:sz="4" w:space="0" w:color="9DB3CC"/>
@@ -4331,7 +4335,7 @@
         </w:tc>
         <w:tc>
           <w:tcPr>
-            <w:tcW w:w="2319" w:type="dxa"/>
+            <w:tcW w:w="2320" w:type="dxa"/>
             <w:tcBorders>
               <w:top w:val="single" w:sz="4" w:space="0" w:color="9DB3CC"/>
               <w:start w:val="single" w:sz="4" w:space="0" w:color="9DB3CC"/>
@@ -4409,7 +4413,7 @@
         </w:tc>
         <w:tc>
           <w:tcPr>
-            <w:tcW w:w="2317" w:type="dxa"/>
+            <w:tcW w:w="2316" w:type="dxa"/>
             <w:tcBorders>
               <w:top w:val="single" w:sz="4" w:space="0" w:color="9DB3CC"/>
               <w:start w:val="single" w:sz="4" w:space="0" w:color="9DB3CC"/>
@@ -4434,7 +4438,7 @@
         </w:tc>
         <w:tc>
           <w:tcPr>
-            <w:tcW w:w="2319" w:type="dxa"/>
+            <w:tcW w:w="2320" w:type="dxa"/>
             <w:tcBorders>
               <w:top w:val="single" w:sz="4" w:space="0" w:color="9DB3CC"/>
               <w:start w:val="single" w:sz="4" w:space="0" w:color="9DB3CC"/>
@@ -4511,7 +4515,7 @@
         </w:tc>
         <w:tc>
           <w:tcPr>
-            <w:tcW w:w="2317" w:type="dxa"/>
+            <w:tcW w:w="2316" w:type="dxa"/>
             <w:tcBorders>
               <w:top w:val="single" w:sz="4" w:space="0" w:color="9DB3CC"/>
               <w:start w:val="single" w:sz="4" w:space="0" w:color="9DB3CC"/>
@@ -4535,7 +4539,7 @@
         </w:tc>
         <w:tc>
           <w:tcPr>
-            <w:tcW w:w="2319" w:type="dxa"/>
+            <w:tcW w:w="2320" w:type="dxa"/>
             <w:tcBorders>
               <w:top w:val="single" w:sz="4" w:space="0" w:color="9DB3CC"/>
               <w:start w:val="single" w:sz="4" w:space="0" w:color="9DB3CC"/>
@@ -4613,7 +4617,7 @@
         </w:tc>
         <w:tc>
           <w:tcPr>
-            <w:tcW w:w="2317" w:type="dxa"/>
+            <w:tcW w:w="2316" w:type="dxa"/>
             <w:tcBorders>
               <w:top w:val="single" w:sz="4" w:space="0" w:color="9DB3CC"/>
               <w:start w:val="single" w:sz="4" w:space="0" w:color="9DB3CC"/>
@@ -4638,7 +4642,7 @@
         </w:tc>
         <w:tc>
           <w:tcPr>
-            <w:tcW w:w="2319" w:type="dxa"/>
+            <w:tcW w:w="2320" w:type="dxa"/>
             <w:tcBorders>
               <w:top w:val="single" w:sz="4" w:space="0" w:color="9DB3CC"/>
               <w:start w:val="single" w:sz="4" w:space="0" w:color="9DB3CC"/>
@@ -4715,7 +4719,7 @@
         </w:tc>
         <w:tc>
           <w:tcPr>
-            <w:tcW w:w="2317" w:type="dxa"/>
+            <w:tcW w:w="2316" w:type="dxa"/>
             <w:tcBorders>
               <w:top w:val="single" w:sz="4" w:space="0" w:color="9DB3CC"/>
               <w:start w:val="single" w:sz="4" w:space="0" w:color="9DB3CC"/>
@@ -4739,7 +4743,7 @@
         </w:tc>
         <w:tc>
           <w:tcPr>
-            <w:tcW w:w="2319" w:type="dxa"/>
+            <w:tcW w:w="2320" w:type="dxa"/>
             <w:tcBorders>
               <w:top w:val="single" w:sz="4" w:space="0" w:color="9DB3CC"/>
               <w:start w:val="single" w:sz="4" w:space="0" w:color="9DB3CC"/>
@@ -4817,7 +4821,7 @@
         </w:tc>
         <w:tc>
           <w:tcPr>
-            <w:tcW w:w="2317" w:type="dxa"/>
+            <w:tcW w:w="2316" w:type="dxa"/>
             <w:tcBorders>
               <w:top w:val="single" w:sz="4" w:space="0" w:color="9DB3CC"/>
               <w:start w:val="single" w:sz="4" w:space="0" w:color="9DB3CC"/>
@@ -4842,7 +4846,7 @@
         </w:tc>
         <w:tc>
           <w:tcPr>
-            <w:tcW w:w="2319" w:type="dxa"/>
+            <w:tcW w:w="2320" w:type="dxa"/>
             <w:tcBorders>
               <w:top w:val="single" w:sz="4" w:space="0" w:color="9DB3CC"/>
               <w:start w:val="single" w:sz="4" w:space="0" w:color="9DB3CC"/>
@@ -4926,7 +4930,7 @@
         <wp:inline distT="0" distB="0" distL="0" distR="0">
           <wp:extent cx="5760085" cy="720090"/>
           <wp:effectExtent l="0" t="0" r="0" b="0"/>
-          <wp:docPr id="3" name="Imagen3"/>
+          <wp:docPr id="3" name="Imagen4"/>
           <wp:cNvGraphicFramePr>
             <a:graphicFrameLocks xmlns:a="http://schemas.openxmlformats.org/drawingml/2006/main" noChangeAspect="1"/>
           </wp:cNvGraphicFramePr>
@@ -4934,7 +4938,7 @@
             <a:graphicData uri="http://schemas.openxmlformats.org/drawingml/2006/picture">
               <pic:pic xmlns:pic="http://schemas.openxmlformats.org/drawingml/2006/picture">
                 <pic:nvPicPr>
-                  <pic:cNvPr id="3" name="Imagen3"/>
+                  <pic:cNvPr id="3" name="Imagen4"/>
                   <pic:cNvPicPr>
                     <a:picLocks noChangeAspect="1" noChangeArrowheads="1"/>
                   </pic:cNvPicPr>
@@ -4980,7 +4984,7 @@
         <wp:inline distT="0" distB="0" distL="0" distR="0">
           <wp:extent cx="5760085" cy="720090"/>
           <wp:effectExtent l="0" t="0" r="0" b="0"/>
-          <wp:docPr id="4" name="Imagen3"/>
+          <wp:docPr id="4" name="Imagen4"/>
           <wp:cNvGraphicFramePr>
             <a:graphicFrameLocks xmlns:a="http://schemas.openxmlformats.org/drawingml/2006/main" noChangeAspect="1"/>
           </wp:cNvGraphicFramePr>
@@ -4988,7 +4992,7 @@
             <a:graphicData uri="http://schemas.openxmlformats.org/drawingml/2006/picture">
               <pic:pic xmlns:pic="http://schemas.openxmlformats.org/drawingml/2006/picture">
                 <pic:nvPicPr>
-                  <pic:cNvPr id="4" name="Imagen3"/>
+                  <pic:cNvPr id="4" name="Imagen4"/>
                   <pic:cNvPicPr>
                     <a:picLocks noChangeAspect="1" noChangeArrowheads="1"/>
                   </pic:cNvPicPr>
@@ -5445,6 +5449,7 @@
     <w:qFormat/>
     <w:pPr>
       <w:widowControl/>
+      <w:suppressAutoHyphens w:val="true"/>
       <w:bidi w:val="0"/>
       <w:spacing w:lineRule="auto" w:line="276" w:before="0" w:after="120"/>
       <w:jc w:val="start"/>
@@ -5752,6 +5757,36 @@
       <w:rFonts w:cs="Arial"/>
     </w:rPr>
   </w:style>
+  <w:style w:type="paragraph" w:styleId="Ttulouser">
+    <w:name w:val="Título (user)"/>
+    <w:basedOn w:val="Normal"/>
+    <w:next w:val="BodyText"/>
+    <w:pPr>
+      <w:keepNext w:val="true"/>
+      <w:spacing w:before="240" w:after="120"/>
+    </w:pPr>
+    <w:rPr>
+      <w:rFonts w:ascii="Liberation Sans" w:hAnsi="Liberation Sans" w:eastAsia="Microsoft YaHei" w:cs="Arial"/>
+      <w:sz w:val="28"/>
+      <w:szCs w:val="28"/>
+    </w:rPr>
+  </w:style>
+  <w:style w:type="paragraph" w:styleId="ndiceuser">
+    <w:name w:val="Índice (user)"/>
+    <w:basedOn w:val="Normal"/>
+    <w:pPr>
+      <w:suppressLineNumbers/>
+    </w:pPr>
+    <w:rPr>
+      <w:rFonts w:cs="Arial"/>
+    </w:rPr>
+  </w:style>
+  <w:style w:type="paragraph" w:styleId="Cabeceraypieuser">
+    <w:name w:val="Cabecera y pie (user)"/>
+    <w:basedOn w:val="Normal"/>
+    <w:pPr/>
+    <w:rPr/>
+  </w:style>
   <w:style w:type="paragraph" w:styleId="Cabeceraypie">
     <w:name w:val="Cabecera y pie"/>
     <w:basedOn w:val="Normal"/>
@@ -5818,8 +5853,8 @@
     </w:pPr>
     <w:rPr/>
   </w:style>
-  <w:style w:type="numbering" w:styleId="Ningunalista" w:default="1">
-    <w:name w:val="Ninguna lista"/>
+  <w:style w:type="numbering" w:styleId="Ningunalistauser" w:default="1">
+    <w:name w:val="Ninguna lista (user)"/>
     <w:uiPriority w:val="99"/>
     <w:semiHidden/>
     <w:unhideWhenUsed/>

</xml_diff>